<commit_message>
Fix rendering for Streamlit Cloud
</commit_message>
<xml_diff>
--- a/docs/AI Operator in a Digital Twin Environment .docx
+++ b/docs/AI Operator in a Digital Twin Environment .docx
@@ -293,6 +293,281 @@
         <w:t xml:space="preserve">                    12.3.2026</w:t>
       </w:r>
     </w:p>
+    <w:sdt>
+      <w:sdtPr>
+        <w:rPr>
+          <w:rFonts w:ascii="Times New Roman" w:hAnsi="Times New Roman" w:cs="Times New Roman"/>
+          <w:sz w:val="24"/>
+          <w:szCs w:val="24"/>
+        </w:rPr>
+        <w:id w:val="-14235512"/>
+        <w:docPartObj>
+          <w:docPartGallery w:val="Table of Contents"/>
+          <w:docPartUnique/>
+        </w:docPartObj>
+      </w:sdtPr>
+      <w:sdtEndPr>
+        <w:rPr>
+          <w:rFonts w:asciiTheme="minorHAnsi" w:eastAsiaTheme="minorHAnsi" w:hAnsiTheme="minorHAnsi" w:cstheme="minorBidi"/>
+          <w:b/>
+          <w:bCs/>
+          <w:noProof/>
+          <w:color w:val="auto"/>
+        </w:rPr>
+      </w:sdtEndPr>
+      <w:sdtContent>
+        <w:p>
+          <w:pPr>
+            <w:pStyle w:val="Heading1"/>
+            <w:rPr>
+              <w:rStyle w:val="Heading1Char"/>
+              <w:rFonts w:ascii="Times New Roman" w:hAnsi="Times New Roman" w:cs="Times New Roman"/>
+              <w:sz w:val="24"/>
+              <w:szCs w:val="24"/>
+            </w:rPr>
+          </w:pPr>
+          <w:r>
+            <w:rPr>
+              <w:rStyle w:val="Heading1Char"/>
+              <w:rFonts w:ascii="Times New Roman" w:hAnsi="Times New Roman" w:cs="Times New Roman"/>
+              <w:sz w:val="24"/>
+              <w:szCs w:val="24"/>
+            </w:rPr>
+            <w:t>Table of Contents</w:t>
+          </w:r>
+        </w:p>
+        <w:p>
+          <w:pPr>
+            <w:pStyle w:val="TOC1"/>
+            <w:tabs>
+              <w:tab w:val="right" w:leader="dot" w:pos="9350"/>
+            </w:tabs>
+            <w:rPr>
+              <w:rFonts w:eastAsiaTheme="minorEastAsia"/>
+              <w:noProof/>
+            </w:rPr>
+          </w:pPr>
+          <w:r>
+            <w:fldChar w:fldCharType="begin"/>
+          </w:r>
+          <w:r>
+            <w:instrText xml:space="preserve"> TOC \o "1-3" \h \z \u </w:instrText>
+          </w:r>
+          <w:r>
+            <w:fldChar w:fldCharType="separate"/>
+          </w:r>
+          <w:hyperlink w:anchor="_Toc224250528" w:history="1">
+            <w:r>
+              <w:rPr>
+                <w:rStyle w:val="Hyperlink"/>
+                <w:rFonts w:ascii="Times New Roman" w:hAnsi="Times New Roman" w:cs="Times New Roman"/>
+                <w:b/>
+                <w:bCs/>
+                <w:noProof/>
+              </w:rPr>
+              <w:t>1.0 INTRODUCTION</w:t>
+            </w:r>
+            <w:r>
+              <w:rPr>
+                <w:noProof/>
+                <w:webHidden/>
+              </w:rPr>
+              <w:tab/>
+            </w:r>
+            <w:r>
+              <w:rPr>
+                <w:noProof/>
+                <w:webHidden/>
+              </w:rPr>
+              <w:fldChar w:fldCharType="begin"/>
+            </w:r>
+            <w:r>
+              <w:rPr>
+                <w:noProof/>
+                <w:webHidden/>
+              </w:rPr>
+              <w:instrText xml:space="preserve"> PAGEREF _Toc224250528 \h </w:instrText>
+            </w:r>
+            <w:r>
+              <w:rPr>
+                <w:noProof/>
+                <w:webHidden/>
+              </w:rPr>
+            </w:r>
+            <w:r>
+              <w:rPr>
+                <w:noProof/>
+                <w:webHidden/>
+              </w:rPr>
+              <w:fldChar w:fldCharType="separate"/>
+            </w:r>
+            <w:r>
+              <w:rPr>
+                <w:noProof/>
+                <w:webHidden/>
+              </w:rPr>
+              <w:t>3</w:t>
+            </w:r>
+            <w:r>
+              <w:rPr>
+                <w:noProof/>
+                <w:webHidden/>
+              </w:rPr>
+              <w:fldChar w:fldCharType="end"/>
+            </w:r>
+          </w:hyperlink>
+        </w:p>
+        <w:p>
+          <w:pPr>
+            <w:pStyle w:val="TOC2"/>
+            <w:tabs>
+              <w:tab w:val="right" w:leader="dot" w:pos="9350"/>
+            </w:tabs>
+            <w:rPr>
+              <w:rFonts w:eastAsiaTheme="minorEastAsia"/>
+              <w:noProof/>
+            </w:rPr>
+          </w:pPr>
+          <w:hyperlink w:anchor="_Toc224250529" w:history="1">
+            <w:r>
+              <w:rPr>
+                <w:rStyle w:val="Hyperlink"/>
+                <w:noProof/>
+              </w:rPr>
+              <w:t>1.1 Sub</w:t>
+            </w:r>
+            <w:r>
+              <w:rPr>
+                <w:noProof/>
+                <w:webHidden/>
+              </w:rPr>
+              <w:tab/>
+            </w:r>
+            <w:r>
+              <w:rPr>
+                <w:noProof/>
+                <w:webHidden/>
+              </w:rPr>
+              <w:fldChar w:fldCharType="begin"/>
+            </w:r>
+            <w:r>
+              <w:rPr>
+                <w:noProof/>
+                <w:webHidden/>
+              </w:rPr>
+              <w:instrText xml:space="preserve"> PAGEREF _Toc224250529 \h </w:instrText>
+            </w:r>
+            <w:r>
+              <w:rPr>
+                <w:noProof/>
+                <w:webHidden/>
+              </w:rPr>
+            </w:r>
+            <w:r>
+              <w:rPr>
+                <w:noProof/>
+                <w:webHidden/>
+              </w:rPr>
+              <w:fldChar w:fldCharType="separate"/>
+            </w:r>
+            <w:r>
+              <w:rPr>
+                <w:noProof/>
+                <w:webHidden/>
+              </w:rPr>
+              <w:t>3</w:t>
+            </w:r>
+            <w:r>
+              <w:rPr>
+                <w:noProof/>
+                <w:webHidden/>
+              </w:rPr>
+              <w:fldChar w:fldCharType="end"/>
+            </w:r>
+          </w:hyperlink>
+        </w:p>
+        <w:p>
+          <w:pPr>
+            <w:pStyle w:val="TOC1"/>
+            <w:tabs>
+              <w:tab w:val="right" w:leader="dot" w:pos="9350"/>
+            </w:tabs>
+            <w:rPr>
+              <w:rFonts w:eastAsiaTheme="minorEastAsia"/>
+              <w:noProof/>
+            </w:rPr>
+          </w:pPr>
+          <w:hyperlink w:anchor="_Toc224250530" w:history="1">
+            <w:r>
+              <w:rPr>
+                <w:rStyle w:val="Hyperlink"/>
+                <w:rFonts w:ascii="Times New Roman" w:hAnsi="Times New Roman" w:cs="Times New Roman"/>
+                <w:noProof/>
+              </w:rPr>
+              <w:t>2.0 FMFLLS</w:t>
+            </w:r>
+            <w:r>
+              <w:rPr>
+                <w:noProof/>
+                <w:webHidden/>
+              </w:rPr>
+              <w:tab/>
+            </w:r>
+            <w:r>
+              <w:rPr>
+                <w:noProof/>
+                <w:webHidden/>
+              </w:rPr>
+              <w:fldChar w:fldCharType="begin"/>
+            </w:r>
+            <w:r>
+              <w:rPr>
+                <w:noProof/>
+                <w:webHidden/>
+              </w:rPr>
+              <w:instrText xml:space="preserve"> PAGEREF _Toc224250530 \h </w:instrText>
+            </w:r>
+            <w:r>
+              <w:rPr>
+                <w:noProof/>
+                <w:webHidden/>
+              </w:rPr>
+            </w:r>
+            <w:r>
+              <w:rPr>
+                <w:noProof/>
+                <w:webHidden/>
+              </w:rPr>
+              <w:fldChar w:fldCharType="separate"/>
+            </w:r>
+            <w:r>
+              <w:rPr>
+                <w:noProof/>
+                <w:webHidden/>
+              </w:rPr>
+              <w:t>3</w:t>
+            </w:r>
+            <w:r>
+              <w:rPr>
+                <w:noProof/>
+                <w:webHidden/>
+              </w:rPr>
+              <w:fldChar w:fldCharType="end"/>
+            </w:r>
+          </w:hyperlink>
+        </w:p>
+        <w:p>
+          <w:r>
+            <w:rPr>
+              <w:b/>
+              <w:bCs/>
+              <w:noProof/>
+            </w:rPr>
+            <w:fldChar w:fldCharType="end"/>
+          </w:r>
+        </w:p>
+      </w:sdtContent>
+    </w:sdt>
     <w:p>
       <w:pPr>
         <w:rPr>
@@ -486,6 +761,7 @@
           <w:szCs w:val="24"/>
         </w:rPr>
       </w:pPr>
+      <w:bookmarkStart w:id="0" w:name="_Toc224250528"/>
       <w:r>
         <w:rPr>
           <w:rFonts w:ascii="Times New Roman" w:hAnsi="Times New Roman" w:cs="Times New Roman"/>
@@ -494,9 +770,9 @@
           <w:sz w:val="24"/>
           <w:szCs w:val="24"/>
         </w:rPr>
-        <w:lastRenderedPageBreak/>
         <w:t>1.0 INTRODUCTION</w:t>
       </w:r>
+      <w:bookmarkEnd w:id="0"/>
     </w:p>
     <w:p>
       <w:pPr>
@@ -519,6 +795,7 @@
           <w:szCs w:val="24"/>
         </w:rPr>
       </w:pPr>
+      <w:bookmarkStart w:id="1" w:name="_Toc224250529"/>
       <w:r>
         <w:rPr>
           <w:sz w:val="24"/>
@@ -526,6 +803,7 @@
         </w:rPr>
         <w:t>1.1 Sub</w:t>
       </w:r>
+      <w:bookmarkEnd w:id="1"/>
     </w:p>
     <w:p>
       <w:pPr>
@@ -549,13 +827,14 @@
           <w:szCs w:val="24"/>
         </w:rPr>
       </w:pPr>
+      <w:bookmarkStart w:id="2" w:name="_Toc224250530"/>
       <w:r>
         <w:rPr>
           <w:rFonts w:ascii="Times New Roman" w:hAnsi="Times New Roman" w:cs="Times New Roman"/>
           <w:sz w:val="24"/>
           <w:szCs w:val="24"/>
         </w:rPr>
-        <w:t>2</w:t>
+        <w:t xml:space="preserve">2.0 </w:t>
       </w:r>
       <w:r>
         <w:rPr>
@@ -563,14 +842,56 @@
           <w:sz w:val="24"/>
           <w:szCs w:val="24"/>
         </w:rPr>
-        <w:t xml:space="preserve">.0 </w:t>
-      </w:r>
-      <w:r>
+        <w:t>FMFLLS</w:t>
+      </w:r>
+      <w:bookmarkEnd w:id="2"/>
+    </w:p>
+    <w:p>
+      <w:pPr>
+        <w:rPr>
+          <w:rFonts w:ascii="Times New Roman" w:hAnsi="Times New Roman" w:cs="Times New Roman"/>
+        </w:rPr>
+      </w:pPr>
+      <w:proofErr w:type="spellStart"/>
+      <w:r>
+        <w:rPr>
+          <w:rFonts w:ascii="Times New Roman" w:hAnsi="Times New Roman" w:cs="Times New Roman"/>
+        </w:rPr>
+        <w:t>Jjkk</w:t>
+      </w:r>
+      <w:proofErr w:type="spellEnd"/>
+    </w:p>
+    <w:p>
+      <w:pPr>
+        <w:pStyle w:val="Heading1"/>
         <w:rPr>
           <w:rFonts w:ascii="Times New Roman" w:hAnsi="Times New Roman" w:cs="Times New Roman"/>
           <w:sz w:val="24"/>
           <w:szCs w:val="24"/>
         </w:rPr>
+      </w:pPr>
+      <w:r>
+        <w:rPr>
+          <w:rFonts w:ascii="Times New Roman" w:hAnsi="Times New Roman" w:cs="Times New Roman"/>
+          <w:sz w:val="24"/>
+          <w:szCs w:val="24"/>
+        </w:rPr>
+        <w:t>3</w:t>
+      </w:r>
+      <w:r>
+        <w:rPr>
+          <w:rFonts w:ascii="Times New Roman" w:hAnsi="Times New Roman" w:cs="Times New Roman"/>
+          <w:sz w:val="24"/>
+          <w:szCs w:val="24"/>
+        </w:rPr>
+        <w:t xml:space="preserve">.0 </w:t>
+      </w:r>
+      <w:r>
+        <w:rPr>
+          <w:rFonts w:ascii="Times New Roman" w:hAnsi="Times New Roman" w:cs="Times New Roman"/>
+          <w:sz w:val="24"/>
+          <w:szCs w:val="24"/>
+        </w:rPr>
         <w:t>FMFLLS</w:t>
       </w:r>
     </w:p>
@@ -580,6 +901,372 @@
           <w:rFonts w:ascii="Times New Roman" w:hAnsi="Times New Roman" w:cs="Times New Roman"/>
         </w:rPr>
       </w:pPr>
+      <w:proofErr w:type="spellStart"/>
+      <w:r>
+        <w:rPr>
+          <w:rFonts w:ascii="Times New Roman" w:hAnsi="Times New Roman" w:cs="Times New Roman"/>
+        </w:rPr>
+        <w:t>Jjjkk</w:t>
+      </w:r>
+      <w:proofErr w:type="spellEnd"/>
+    </w:p>
+    <w:p>
+      <w:pPr>
+        <w:pStyle w:val="Heading1"/>
+        <w:rPr>
+          <w:rFonts w:ascii="Times New Roman" w:hAnsi="Times New Roman" w:cs="Times New Roman"/>
+          <w:sz w:val="24"/>
+          <w:szCs w:val="24"/>
+        </w:rPr>
+      </w:pPr>
+      <w:r>
+        <w:rPr>
+          <w:rFonts w:ascii="Times New Roman" w:hAnsi="Times New Roman" w:cs="Times New Roman"/>
+          <w:sz w:val="24"/>
+          <w:szCs w:val="24"/>
+        </w:rPr>
+        <w:t>4</w:t>
+      </w:r>
+      <w:r>
+        <w:rPr>
+          <w:rFonts w:ascii="Times New Roman" w:hAnsi="Times New Roman" w:cs="Times New Roman"/>
+          <w:sz w:val="24"/>
+          <w:szCs w:val="24"/>
+        </w:rPr>
+        <w:t xml:space="preserve">.0 </w:t>
+      </w:r>
+      <w:r>
+        <w:rPr>
+          <w:rFonts w:ascii="Times New Roman" w:hAnsi="Times New Roman" w:cs="Times New Roman"/>
+          <w:sz w:val="24"/>
+          <w:szCs w:val="24"/>
+        </w:rPr>
+        <w:t>FMFLLS</w:t>
+      </w:r>
+    </w:p>
+    <w:p>
+      <w:pPr>
+        <w:rPr>
+          <w:rFonts w:ascii="Times New Roman" w:hAnsi="Times New Roman" w:cs="Times New Roman"/>
+        </w:rPr>
+      </w:pPr>
+      <w:proofErr w:type="spellStart"/>
+      <w:r>
+        <w:rPr>
+          <w:rFonts w:ascii="Times New Roman" w:hAnsi="Times New Roman" w:cs="Times New Roman"/>
+        </w:rPr>
+        <w:t>Hbjhvhf</w:t>
+      </w:r>
+      <w:proofErr w:type="spellEnd"/>
+    </w:p>
+    <w:p>
+      <w:pPr>
+        <w:pStyle w:val="Heading1"/>
+        <w:rPr>
+          <w:rFonts w:ascii="Times New Roman" w:hAnsi="Times New Roman" w:cs="Times New Roman"/>
+          <w:sz w:val="24"/>
+          <w:szCs w:val="24"/>
+        </w:rPr>
+      </w:pPr>
+      <w:r>
+        <w:rPr>
+          <w:rFonts w:ascii="Times New Roman" w:hAnsi="Times New Roman" w:cs="Times New Roman"/>
+          <w:sz w:val="24"/>
+          <w:szCs w:val="24"/>
+        </w:rPr>
+        <w:t>5</w:t>
+      </w:r>
+      <w:r>
+        <w:rPr>
+          <w:rFonts w:ascii="Times New Roman" w:hAnsi="Times New Roman" w:cs="Times New Roman"/>
+          <w:sz w:val="24"/>
+          <w:szCs w:val="24"/>
+        </w:rPr>
+        <w:t xml:space="preserve">.0 </w:t>
+      </w:r>
+      <w:r>
+        <w:rPr>
+          <w:rFonts w:ascii="Times New Roman" w:hAnsi="Times New Roman" w:cs="Times New Roman"/>
+          <w:sz w:val="24"/>
+          <w:szCs w:val="24"/>
+        </w:rPr>
+        <w:t>FMFLLS</w:t>
+      </w:r>
+    </w:p>
+    <w:p>
+      <w:pPr>
+        <w:rPr>
+          <w:rFonts w:ascii="Times New Roman" w:hAnsi="Times New Roman" w:cs="Times New Roman"/>
+        </w:rPr>
+      </w:pPr>
+      <w:proofErr w:type="spellStart"/>
+      <w:r>
+        <w:rPr>
+          <w:rFonts w:ascii="Times New Roman" w:hAnsi="Times New Roman" w:cs="Times New Roman"/>
+        </w:rPr>
+        <w:t>Jhhjjh</w:t>
+      </w:r>
+      <w:proofErr w:type="spellEnd"/>
+    </w:p>
+    <w:p>
+      <w:pPr>
+        <w:pStyle w:val="Heading1"/>
+        <w:rPr>
+          <w:rFonts w:ascii="Times New Roman" w:hAnsi="Times New Roman" w:cs="Times New Roman"/>
+          <w:sz w:val="24"/>
+          <w:szCs w:val="24"/>
+        </w:rPr>
+      </w:pPr>
+      <w:r>
+        <w:rPr>
+          <w:rFonts w:ascii="Times New Roman" w:hAnsi="Times New Roman" w:cs="Times New Roman"/>
+          <w:sz w:val="24"/>
+          <w:szCs w:val="24"/>
+        </w:rPr>
+        <w:t>6</w:t>
+      </w:r>
+      <w:r>
+        <w:rPr>
+          <w:rFonts w:ascii="Times New Roman" w:hAnsi="Times New Roman" w:cs="Times New Roman"/>
+          <w:sz w:val="24"/>
+          <w:szCs w:val="24"/>
+        </w:rPr>
+        <w:t xml:space="preserve">.0 </w:t>
+      </w:r>
+      <w:r>
+        <w:rPr>
+          <w:rFonts w:ascii="Times New Roman" w:hAnsi="Times New Roman" w:cs="Times New Roman"/>
+          <w:sz w:val="24"/>
+          <w:szCs w:val="24"/>
+        </w:rPr>
+        <w:t>FMFLLS</w:t>
+      </w:r>
+    </w:p>
+    <w:p>
+      <w:pPr>
+        <w:rPr>
+          <w:rFonts w:ascii="Times New Roman" w:hAnsi="Times New Roman" w:cs="Times New Roman"/>
+        </w:rPr>
+      </w:pPr>
+      <w:proofErr w:type="spellStart"/>
+      <w:r>
+        <w:rPr>
+          <w:rFonts w:ascii="Times New Roman" w:hAnsi="Times New Roman" w:cs="Times New Roman"/>
+        </w:rPr>
+        <w:t>Gjhj</w:t>
+      </w:r>
+      <w:proofErr w:type="spellEnd"/>
+    </w:p>
+    <w:p>
+      <w:pPr>
+        <w:pStyle w:val="Heading1"/>
+        <w:rPr>
+          <w:rFonts w:ascii="Times New Roman" w:hAnsi="Times New Roman" w:cs="Times New Roman"/>
+          <w:sz w:val="24"/>
+          <w:szCs w:val="24"/>
+        </w:rPr>
+      </w:pPr>
+      <w:r>
+        <w:rPr>
+          <w:rFonts w:ascii="Times New Roman" w:hAnsi="Times New Roman" w:cs="Times New Roman"/>
+          <w:sz w:val="24"/>
+          <w:szCs w:val="24"/>
+        </w:rPr>
+        <w:t>7</w:t>
+      </w:r>
+      <w:r>
+        <w:rPr>
+          <w:rFonts w:ascii="Times New Roman" w:hAnsi="Times New Roman" w:cs="Times New Roman"/>
+          <w:sz w:val="24"/>
+          <w:szCs w:val="24"/>
+        </w:rPr>
+        <w:t xml:space="preserve">.0 </w:t>
+      </w:r>
+      <w:r>
+        <w:rPr>
+          <w:rFonts w:ascii="Times New Roman" w:hAnsi="Times New Roman" w:cs="Times New Roman"/>
+          <w:sz w:val="24"/>
+          <w:szCs w:val="24"/>
+        </w:rPr>
+        <w:t>FMFLLS</w:t>
+      </w:r>
+    </w:p>
+    <w:p>
+      <w:pPr>
+        <w:rPr>
+          <w:rFonts w:ascii="Times New Roman" w:hAnsi="Times New Roman" w:cs="Times New Roman"/>
+        </w:rPr>
+      </w:pPr>
+      <w:proofErr w:type="spellStart"/>
+      <w:r>
+        <w:rPr>
+          <w:rFonts w:ascii="Times New Roman" w:hAnsi="Times New Roman" w:cs="Times New Roman"/>
+        </w:rPr>
+        <w:t>Gfgf</w:t>
+      </w:r>
+      <w:proofErr w:type="spellEnd"/>
+    </w:p>
+    <w:p>
+      <w:pPr>
+        <w:rPr>
+          <w:rFonts w:ascii="Times New Roman" w:hAnsi="Times New Roman" w:cs="Times New Roman"/>
+        </w:rPr>
+      </w:pPr>
+    </w:p>
+    <w:p>
+      <w:pPr>
+        <w:pStyle w:val="ListParagraph"/>
+        <w:numPr>
+          <w:ilvl w:val="0"/>
+          <w:numId w:val="3"/>
+        </w:numPr>
+        <w:rPr>
+          <w:rFonts w:ascii="Times New Roman" w:hAnsi="Times New Roman" w:cs="Times New Roman"/>
+        </w:rPr>
+      </w:pPr>
+      <w:r>
+        <w:rPr>
+          <w:rFonts w:ascii="Times New Roman" w:hAnsi="Times New Roman" w:cs="Times New Roman"/>
+        </w:rPr>
+        <w:t>Loads dataset</w:t>
+      </w:r>
+    </w:p>
+    <w:p>
+      <w:pPr>
+        <w:numPr>
+          <w:ilvl w:val="0"/>
+          <w:numId w:val="2"/>
+        </w:numPr>
+        <w:rPr>
+          <w:rFonts w:ascii="Times New Roman" w:hAnsi="Times New Roman" w:cs="Times New Roman"/>
+        </w:rPr>
+      </w:pPr>
+      <w:r>
+        <w:rPr>
+          <w:rFonts w:ascii="Times New Roman" w:hAnsi="Times New Roman" w:cs="Times New Roman"/>
+        </w:rPr>
+        <w:t xml:space="preserve">Trains </w:t>
+      </w:r>
+      <w:proofErr w:type="spellStart"/>
+      <w:r>
+        <w:rPr>
+          <w:rFonts w:ascii="Times New Roman" w:hAnsi="Times New Roman" w:cs="Times New Roman"/>
+        </w:rPr>
+        <w:t>XGBoost</w:t>
+      </w:r>
+      <w:proofErr w:type="spellEnd"/>
+      <w:r>
+        <w:rPr>
+          <w:rFonts w:ascii="Times New Roman" w:hAnsi="Times New Roman" w:cs="Times New Roman"/>
+        </w:rPr>
+        <w:t xml:space="preserve"> model</w:t>
+      </w:r>
+    </w:p>
+    <w:p>
+      <w:pPr>
+        <w:numPr>
+          <w:ilvl w:val="0"/>
+          <w:numId w:val="2"/>
+        </w:numPr>
+        <w:rPr>
+          <w:rFonts w:ascii="Times New Roman" w:hAnsi="Times New Roman" w:cs="Times New Roman"/>
+        </w:rPr>
+      </w:pPr>
+      <w:r>
+        <w:rPr>
+          <w:rFonts w:ascii="Times New Roman" w:hAnsi="Times New Roman" w:cs="Times New Roman"/>
+        </w:rPr>
+        <w:t>Computes SHAP + LIME explainers</w:t>
+      </w:r>
+    </w:p>
+    <w:p>
+      <w:pPr>
+        <w:numPr>
+          <w:ilvl w:val="0"/>
+          <w:numId w:val="2"/>
+        </w:numPr>
+        <w:rPr>
+          <w:rFonts w:ascii="Times New Roman" w:hAnsi="Times New Roman" w:cs="Times New Roman"/>
+        </w:rPr>
+      </w:pPr>
+      <w:r>
+        <w:rPr>
+          <w:rFonts w:ascii="Times New Roman" w:hAnsi="Times New Roman" w:cs="Times New Roman"/>
+        </w:rPr>
+        <w:t>Evaluates model</w:t>
+      </w:r>
+    </w:p>
+    <w:p>
+      <w:pPr>
+        <w:numPr>
+          <w:ilvl w:val="0"/>
+          <w:numId w:val="2"/>
+        </w:numPr>
+        <w:rPr>
+          <w:rFonts w:ascii="Times New Roman" w:hAnsi="Times New Roman" w:cs="Times New Roman"/>
+        </w:rPr>
+      </w:pPr>
+      <w:r>
+        <w:rPr>
+          <w:rFonts w:ascii="Times New Roman" w:hAnsi="Times New Roman" w:cs="Times New Roman"/>
+        </w:rPr>
+        <w:lastRenderedPageBreak/>
+        <w:t>Prepares everything for the dashboard</w:t>
+      </w:r>
+    </w:p>
+    <w:p>
+      <w:pPr>
+        <w:rPr>
+          <w:rFonts w:ascii="Times New Roman" w:hAnsi="Times New Roman" w:cs="Times New Roman"/>
+        </w:rPr>
+      </w:pPr>
+    </w:p>
+    <w:p>
+      <w:pPr>
+        <w:rPr>
+          <w:rFonts w:ascii="Times New Roman" w:hAnsi="Times New Roman" w:cs="Times New Roman"/>
+        </w:rPr>
+      </w:pPr>
+      <w:r>
+        <w:rPr>
+          <w:rFonts w:ascii="Times New Roman" w:hAnsi="Times New Roman" w:cs="Times New Roman"/>
+        </w:rPr>
+        <w:drawing>
+          <wp:inline distT="0" distB="0" distL="0" distR="0" wp14:anchorId="1BC5B58C" wp14:editId="2A3D6177">
+            <wp:extent cx="5943600" cy="2961005"/>
+            <wp:effectExtent l="0" t="0" r="0" b="0"/>
+            <wp:docPr id="167678206" name="Picture 1"/>
+            <wp:cNvGraphicFramePr>
+              <a:graphicFrameLocks xmlns:a="http://schemas.openxmlformats.org/drawingml/2006/main" noChangeAspect="1"/>
+            </wp:cNvGraphicFramePr>
+            <a:graphic xmlns:a="http://schemas.openxmlformats.org/drawingml/2006/main">
+              <a:graphicData uri="http://schemas.openxmlformats.org/drawingml/2006/picture">
+                <pic:pic xmlns:pic="http://schemas.openxmlformats.org/drawingml/2006/picture">
+                  <pic:nvPicPr>
+                    <pic:cNvPr id="167678206" name=""/>
+                    <pic:cNvPicPr/>
+                  </pic:nvPicPr>
+                  <pic:blipFill>
+                    <a:blip r:embed="rId6"/>
+                    <a:stretch>
+                      <a:fillRect/>
+                    </a:stretch>
+                  </pic:blipFill>
+                  <pic:spPr>
+                    <a:xfrm>
+                      <a:off x="0" y="0"/>
+                      <a:ext cx="5943600" cy="2961005"/>
+                    </a:xfrm>
+                    <a:prstGeom prst="rect">
+                      <a:avLst/>
+                    </a:prstGeom>
+                  </pic:spPr>
+                </pic:pic>
+              </a:graphicData>
+            </a:graphic>
+          </wp:inline>
+        </w:drawing>
+      </w:r>
     </w:p>
     <w:sectPr>
       <w:pgSz w:w="12240" w:h="15840"/>
@@ -594,6 +1281,119 @@
 <file path=word/numbering.xml><?xml version="1.0" encoding="utf-8"?>
 <w:numbering xmlns:wpc="http://schemas.microsoft.com/office/word/2010/wordprocessingCanvas" xmlns:cx="http://schemas.microsoft.com/office/drawing/2014/chartex" xmlns:cx1="http://schemas.microsoft.com/office/drawing/2015/9/8/chartex" xmlns:cx2="http://schemas.microsoft.com/office/drawing/2015/10/21/chartex" xmlns:cx3="http://schemas.microsoft.com/office/drawing/2016/5/9/chartex" xmlns:cx4="http://schemas.microsoft.com/office/drawing/2016/5/10/chartex" xmlns:cx5="http://schemas.microsoft.com/office/drawing/2016/5/11/chartex" xmlns:cx6="http://schemas.microsoft.com/office/drawing/2016/5/12/chartex" xmlns:cx7="http://schemas.microsoft.com/office/drawing/2016/5/13/chartex" xmlns:cx8="http://schemas.microsoft.com/office/drawing/2016/5/14/chartex" xmlns:mc="http://schemas.openxmlformats.org/markup-compatibility/2006" xmlns:aink="http://schemas.microsoft.com/office/drawing/2016/ink" xmlns:am3d="http://schemas.microsoft.com/office/drawing/2017/model3d" xmlns:o="urn:schemas-microsoft-com:office:office" xmlns:oel="http://schemas.microsoft.com/office/2019/extlst" xmlns:r="http://schemas.openxmlformats.org/officeDocument/2006/relationships" xmlns:m="http://schemas.openxmlformats.org/officeDocument/2006/math" xmlns:v="urn:schemas-microsoft-com:vml" xmlns:wp14="http://schemas.microsoft.com/office/word/2010/wordprocessingDrawing" xmlns:wp="http://schemas.openxmlformats.org/drawingml/2006/wordprocessingDrawing" xmlns:w10="urn:schemas-microsoft-com:office:word" xmlns:w="http://schemas.openxmlformats.org/wordprocessingml/2006/main" xmlns:w14="http://schemas.microsoft.com/office/word/2010/wordml" xmlns:w15="http://schemas.microsoft.com/office/word/2012/wordml" xmlns:w16cex="http://schemas.microsoft.com/office/word/2018/wordml/cex" xmlns:w16cid="http://schemas.microsoft.com/office/word/2016/wordml/cid" xmlns:w16="http://schemas.microsoft.com/office/word/2018/wordml" xmlns:w16du="http://schemas.microsoft.com/office/word/2023/wordml/word16du" xmlns:w16sdtdh="http://schemas.microsoft.com/office/word/2020/wordml/sdtdatahash" xmlns:w16sdtfl="http://schemas.microsoft.com/office/word/2024/wordml/sdtformatlock" xmlns:w16se="http://schemas.microsoft.com/office/word/2015/wordml/symex" xmlns:wpg="http://schemas.microsoft.com/office/word/2010/wordprocessingGroup" xmlns:wpi="http://schemas.microsoft.com/office/word/2010/wordprocessingInk" xmlns:wne="http://schemas.microsoft.com/office/word/2006/wordml" xmlns:wps="http://schemas.microsoft.com/office/word/2010/wordprocessingShape" mc:Ignorable="w14 w15 w16se w16cid w16 w16cex w16sdtdh w16sdtfl w16du wp14">
   <w:abstractNum w:abstractNumId="0" w15:restartNumberingAfterBreak="0">
+    <w:nsid w:val="0973255F"/>
+    <w:multiLevelType w:val="hybridMultilevel"/>
+    <w:tmpl w:val="C78E04AA"/>
+    <w:lvl w:ilvl="0" w:tplc="04090001">
+      <w:start w:val="1"/>
+      <w:numFmt w:val="bullet"/>
+      <w:lvlText w:val=""/>
+      <w:lvlJc w:val="left"/>
+      <w:pPr>
+        <w:ind w:left="720" w:hanging="360"/>
+      </w:pPr>
+      <w:rPr>
+        <w:rFonts w:ascii="Symbol" w:hAnsi="Symbol" w:hint="default"/>
+      </w:rPr>
+    </w:lvl>
+    <w:lvl w:ilvl="1" w:tplc="04090003" w:tentative="1">
+      <w:start w:val="1"/>
+      <w:numFmt w:val="bullet"/>
+      <w:lvlText w:val="o"/>
+      <w:lvlJc w:val="left"/>
+      <w:pPr>
+        <w:ind w:left="1440" w:hanging="360"/>
+      </w:pPr>
+      <w:rPr>
+        <w:rFonts w:ascii="Courier New" w:hAnsi="Courier New" w:cs="Courier New" w:hint="default"/>
+      </w:rPr>
+    </w:lvl>
+    <w:lvl w:ilvl="2" w:tplc="04090005" w:tentative="1">
+      <w:start w:val="1"/>
+      <w:numFmt w:val="bullet"/>
+      <w:lvlText w:val=""/>
+      <w:lvlJc w:val="left"/>
+      <w:pPr>
+        <w:ind w:left="2160" w:hanging="360"/>
+      </w:pPr>
+      <w:rPr>
+        <w:rFonts w:ascii="Wingdings" w:hAnsi="Wingdings" w:hint="default"/>
+      </w:rPr>
+    </w:lvl>
+    <w:lvl w:ilvl="3" w:tplc="04090001" w:tentative="1">
+      <w:start w:val="1"/>
+      <w:numFmt w:val="bullet"/>
+      <w:lvlText w:val=""/>
+      <w:lvlJc w:val="left"/>
+      <w:pPr>
+        <w:ind w:left="2880" w:hanging="360"/>
+      </w:pPr>
+      <w:rPr>
+        <w:rFonts w:ascii="Symbol" w:hAnsi="Symbol" w:hint="default"/>
+      </w:rPr>
+    </w:lvl>
+    <w:lvl w:ilvl="4" w:tplc="04090003" w:tentative="1">
+      <w:start w:val="1"/>
+      <w:numFmt w:val="bullet"/>
+      <w:lvlText w:val="o"/>
+      <w:lvlJc w:val="left"/>
+      <w:pPr>
+        <w:ind w:left="3600" w:hanging="360"/>
+      </w:pPr>
+      <w:rPr>
+        <w:rFonts w:ascii="Courier New" w:hAnsi="Courier New" w:cs="Courier New" w:hint="default"/>
+      </w:rPr>
+    </w:lvl>
+    <w:lvl w:ilvl="5" w:tplc="04090005" w:tentative="1">
+      <w:start w:val="1"/>
+      <w:numFmt w:val="bullet"/>
+      <w:lvlText w:val=""/>
+      <w:lvlJc w:val="left"/>
+      <w:pPr>
+        <w:ind w:left="4320" w:hanging="360"/>
+      </w:pPr>
+      <w:rPr>
+        <w:rFonts w:ascii="Wingdings" w:hAnsi="Wingdings" w:hint="default"/>
+      </w:rPr>
+    </w:lvl>
+    <w:lvl w:ilvl="6" w:tplc="04090001" w:tentative="1">
+      <w:start w:val="1"/>
+      <w:numFmt w:val="bullet"/>
+      <w:lvlText w:val=""/>
+      <w:lvlJc w:val="left"/>
+      <w:pPr>
+        <w:ind w:left="5040" w:hanging="360"/>
+      </w:pPr>
+      <w:rPr>
+        <w:rFonts w:ascii="Symbol" w:hAnsi="Symbol" w:hint="default"/>
+      </w:rPr>
+    </w:lvl>
+    <w:lvl w:ilvl="7" w:tplc="04090003" w:tentative="1">
+      <w:start w:val="1"/>
+      <w:numFmt w:val="bullet"/>
+      <w:lvlText w:val="o"/>
+      <w:lvlJc w:val="left"/>
+      <w:pPr>
+        <w:ind w:left="5760" w:hanging="360"/>
+      </w:pPr>
+      <w:rPr>
+        <w:rFonts w:ascii="Courier New" w:hAnsi="Courier New" w:cs="Courier New" w:hint="default"/>
+      </w:rPr>
+    </w:lvl>
+    <w:lvl w:ilvl="8" w:tplc="04090005" w:tentative="1">
+      <w:start w:val="1"/>
+      <w:numFmt w:val="bullet"/>
+      <w:lvlText w:val=""/>
+      <w:lvlJc w:val="left"/>
+      <w:pPr>
+        <w:ind w:left="6480" w:hanging="360"/>
+      </w:pPr>
+      <w:rPr>
+        <w:rFonts w:ascii="Wingdings" w:hAnsi="Wingdings" w:hint="default"/>
+      </w:rPr>
+    </w:lvl>
+  </w:abstractNum>
+  <w:abstractNum w:abstractNumId="1" w15:restartNumberingAfterBreak="0">
     <w:nsid w:val="52182BC5"/>
     <w:multiLevelType w:val="multilevel"/>
     <w:tmpl w:val="B618342E"/>
@@ -710,7 +1510,162 @@
       </w:rPr>
     </w:lvl>
   </w:abstractNum>
+  <w:abstractNum w:abstractNumId="2" w15:restartNumberingAfterBreak="0">
+    <w:nsid w:val="60AB49CF"/>
+    <w:multiLevelType w:val="multilevel"/>
+    <w:tmpl w:val="861EB86E"/>
+    <w:lvl w:ilvl="0">
+      <w:start w:val="1"/>
+      <w:numFmt w:val="bullet"/>
+      <w:lvlText w:val=""/>
+      <w:lvlJc w:val="left"/>
+      <w:pPr>
+        <w:tabs>
+          <w:tab w:val="num" w:pos="720"/>
+        </w:tabs>
+        <w:ind w:left="720" w:hanging="360"/>
+      </w:pPr>
+      <w:rPr>
+        <w:rFonts w:ascii="Symbol" w:hAnsi="Symbol" w:hint="default"/>
+        <w:sz w:val="20"/>
+      </w:rPr>
+    </w:lvl>
+    <w:lvl w:ilvl="1" w:tentative="1">
+      <w:start w:val="1"/>
+      <w:numFmt w:val="bullet"/>
+      <w:lvlText w:val="o"/>
+      <w:lvlJc w:val="left"/>
+      <w:pPr>
+        <w:tabs>
+          <w:tab w:val="num" w:pos="1440"/>
+        </w:tabs>
+        <w:ind w:left="1440" w:hanging="360"/>
+      </w:pPr>
+      <w:rPr>
+        <w:rFonts w:ascii="Courier New" w:hAnsi="Courier New" w:hint="default"/>
+        <w:sz w:val="20"/>
+      </w:rPr>
+    </w:lvl>
+    <w:lvl w:ilvl="2" w:tentative="1">
+      <w:start w:val="1"/>
+      <w:numFmt w:val="bullet"/>
+      <w:lvlText w:val=""/>
+      <w:lvlJc w:val="left"/>
+      <w:pPr>
+        <w:tabs>
+          <w:tab w:val="num" w:pos="2160"/>
+        </w:tabs>
+        <w:ind w:left="2160" w:hanging="360"/>
+      </w:pPr>
+      <w:rPr>
+        <w:rFonts w:ascii="Wingdings" w:hAnsi="Wingdings" w:hint="default"/>
+        <w:sz w:val="20"/>
+      </w:rPr>
+    </w:lvl>
+    <w:lvl w:ilvl="3" w:tentative="1">
+      <w:start w:val="1"/>
+      <w:numFmt w:val="bullet"/>
+      <w:lvlText w:val=""/>
+      <w:lvlJc w:val="left"/>
+      <w:pPr>
+        <w:tabs>
+          <w:tab w:val="num" w:pos="2880"/>
+        </w:tabs>
+        <w:ind w:left="2880" w:hanging="360"/>
+      </w:pPr>
+      <w:rPr>
+        <w:rFonts w:ascii="Wingdings" w:hAnsi="Wingdings" w:hint="default"/>
+        <w:sz w:val="20"/>
+      </w:rPr>
+    </w:lvl>
+    <w:lvl w:ilvl="4" w:tentative="1">
+      <w:start w:val="1"/>
+      <w:numFmt w:val="bullet"/>
+      <w:lvlText w:val=""/>
+      <w:lvlJc w:val="left"/>
+      <w:pPr>
+        <w:tabs>
+          <w:tab w:val="num" w:pos="3600"/>
+        </w:tabs>
+        <w:ind w:left="3600" w:hanging="360"/>
+      </w:pPr>
+      <w:rPr>
+        <w:rFonts w:ascii="Wingdings" w:hAnsi="Wingdings" w:hint="default"/>
+        <w:sz w:val="20"/>
+      </w:rPr>
+    </w:lvl>
+    <w:lvl w:ilvl="5" w:tentative="1">
+      <w:start w:val="1"/>
+      <w:numFmt w:val="bullet"/>
+      <w:lvlText w:val=""/>
+      <w:lvlJc w:val="left"/>
+      <w:pPr>
+        <w:tabs>
+          <w:tab w:val="num" w:pos="4320"/>
+        </w:tabs>
+        <w:ind w:left="4320" w:hanging="360"/>
+      </w:pPr>
+      <w:rPr>
+        <w:rFonts w:ascii="Wingdings" w:hAnsi="Wingdings" w:hint="default"/>
+        <w:sz w:val="20"/>
+      </w:rPr>
+    </w:lvl>
+    <w:lvl w:ilvl="6" w:tentative="1">
+      <w:start w:val="1"/>
+      <w:numFmt w:val="bullet"/>
+      <w:lvlText w:val=""/>
+      <w:lvlJc w:val="left"/>
+      <w:pPr>
+        <w:tabs>
+          <w:tab w:val="num" w:pos="5040"/>
+        </w:tabs>
+        <w:ind w:left="5040" w:hanging="360"/>
+      </w:pPr>
+      <w:rPr>
+        <w:rFonts w:ascii="Wingdings" w:hAnsi="Wingdings" w:hint="default"/>
+        <w:sz w:val="20"/>
+      </w:rPr>
+    </w:lvl>
+    <w:lvl w:ilvl="7" w:tentative="1">
+      <w:start w:val="1"/>
+      <w:numFmt w:val="bullet"/>
+      <w:lvlText w:val=""/>
+      <w:lvlJc w:val="left"/>
+      <w:pPr>
+        <w:tabs>
+          <w:tab w:val="num" w:pos="5760"/>
+        </w:tabs>
+        <w:ind w:left="5760" w:hanging="360"/>
+      </w:pPr>
+      <w:rPr>
+        <w:rFonts w:ascii="Wingdings" w:hAnsi="Wingdings" w:hint="default"/>
+        <w:sz w:val="20"/>
+      </w:rPr>
+    </w:lvl>
+    <w:lvl w:ilvl="8" w:tentative="1">
+      <w:start w:val="1"/>
+      <w:numFmt w:val="bullet"/>
+      <w:lvlText w:val=""/>
+      <w:lvlJc w:val="left"/>
+      <w:pPr>
+        <w:tabs>
+          <w:tab w:val="num" w:pos="6480"/>
+        </w:tabs>
+        <w:ind w:left="6480" w:hanging="360"/>
+      </w:pPr>
+      <w:rPr>
+        <w:rFonts w:ascii="Wingdings" w:hAnsi="Wingdings" w:hint="default"/>
+        <w:sz w:val="20"/>
+      </w:rPr>
+    </w:lvl>
+  </w:abstractNum>
   <w:num w:numId="1" w16cid:durableId="564268157">
+    <w:abstractNumId w:val="1"/>
+  </w:num>
+  <w:num w:numId="2" w16cid:durableId="1638098074">
+    <w:abstractNumId w:val="2"/>
+  </w:num>
+  <w:num w:numId="3" w16cid:durableId="288127117">
     <w:abstractNumId w:val="0"/>
   </w:num>
 </w:numbering>
@@ -1631,6 +2586,60 @@
       <w:spacing w:val="5"/>
     </w:rPr>
   </w:style>
+  <w:style w:type="paragraph" w:styleId="TOCHeading">
+    <w:name w:val="TOC Heading"/>
+    <w:basedOn w:val="Heading1"/>
+    <w:next w:val="Normal"/>
+    <w:uiPriority w:val="39"/>
+    <w:unhideWhenUsed/>
+    <w:qFormat/>
+    <w:rsid w:val="009B7AB3"/>
+    <w:pPr>
+      <w:spacing w:before="240" w:after="0" w:line="259" w:lineRule="auto"/>
+      <w:outlineLvl w:val="9"/>
+    </w:pPr>
+    <w:rPr>
+      <w:kern w:val="0"/>
+      <w:sz w:val="32"/>
+      <w:szCs w:val="32"/>
+    </w:rPr>
+  </w:style>
+  <w:style w:type="paragraph" w:styleId="TOC1">
+    <w:name w:val="toc 1"/>
+    <w:basedOn w:val="Normal"/>
+    <w:next w:val="Normal"/>
+    <w:autoRedefine/>
+    <w:uiPriority w:val="39"/>
+    <w:unhideWhenUsed/>
+    <w:rsid w:val="009B7AB3"/>
+    <w:pPr>
+      <w:spacing w:after="100"/>
+    </w:pPr>
+  </w:style>
+  <w:style w:type="paragraph" w:styleId="TOC2">
+    <w:name w:val="toc 2"/>
+    <w:basedOn w:val="Normal"/>
+    <w:next w:val="Normal"/>
+    <w:autoRedefine/>
+    <w:uiPriority w:val="39"/>
+    <w:unhideWhenUsed/>
+    <w:rsid w:val="009B7AB3"/>
+    <w:pPr>
+      <w:spacing w:after="100"/>
+      <w:ind w:left="240"/>
+    </w:pPr>
+  </w:style>
+  <w:style w:type="character" w:styleId="Hyperlink">
+    <w:name w:val="Hyperlink"/>
+    <w:basedOn w:val="DefaultParagraphFont"/>
+    <w:uiPriority w:val="99"/>
+    <w:unhideWhenUsed/>
+    <w:rsid w:val="009B7AB3"/>
+    <w:rPr>
+      <w:color w:val="0563C1" w:themeColor="hyperlink"/>
+      <w:u w:val="single"/>
+    </w:rPr>
+  </w:style>
 </w:styles>
 </file>
 
@@ -1927,4 +2936,16 @@
     </a:ext>
   </a:extLst>
 </a:theme>
+</file>
+
+<file path=customXml/item1.xml><?xml version="1.0" encoding="utf-8"?>
+<b:Sources xmlns:b="http://schemas.openxmlformats.org/officeDocument/2006/bibliography" xmlns="http://schemas.openxmlformats.org/officeDocument/2006/bibliography" SelectedStyle="\APASixthEditionOfficeOnline.xsl" StyleName="APA" Version="6"/>
+</file>
+
+<file path=customXml/itemProps1.xml><?xml version="1.0" encoding="utf-8"?>
+<ds:datastoreItem xmlns:ds="http://schemas.openxmlformats.org/officeDocument/2006/customXml" ds:itemID="{C41AB9C6-AE61-4E0C-B547-FAEDDF4B92DF}">
+  <ds:schemaRefs>
+    <ds:schemaRef ds:uri="http://schemas.openxmlformats.org/officeDocument/2006/bibliography"/>
+  </ds:schemaRefs>
+</ds:datastoreItem>
 </file>
</xml_diff>